<commit_message>
Annex IV summary: align with Official Journal text of Article 11 and Annex IV; classification reasoning
Co-Authored-By: Claude Sonnet 5.5 <noreply@anthropic.com>
Claude-Session: https://claude.ai/code/session_01QhzwnEWQ4QfqKTzswE5K7H
</commit_message>
<xml_diff>
--- a/week7_capstone/docs/ANNEX_IV.docx
+++ b/week7_capstone/docs/ANNEX_IV.docx
@@ -204,31 +204,31 @@
         <w:t xml:space="preserve"> </w:t>
       </w:r>
       <w:r>
-        <w:t xml:space="preserve">The Annex IV headings and the Article 11 requirement used here come from a secondary summary of the</w:t>
-      </w:r>
-      <w:r>
-        <w:t xml:space="preserve"> </w:t>
-      </w:r>
-      <w:r>
-        <w:t xml:space="preserve">Regulation supplied for this assignment, not from the Official Journal text, which I could not open from my working</w:t>
-      </w:r>
-      <w:r>
-        <w:t xml:space="preserve"> </w:t>
-      </w:r>
-      <w:r>
-        <w:t xml:space="preserve">environment. Before submission, each heading and the Article 11(1) wording should be checked against the Regulation on</w:t>
-      </w:r>
-      <w:r>
-        <w:t xml:space="preserve"> </w:t>
-      </w:r>
-      <w:r>
-        <w:t xml:space="preserve">EUR-Lex. Application dates and amending acts are left out because they do not affect this exercise and I could not verify</w:t>
-      </w:r>
-      <w:r>
-        <w:t xml:space="preserve"> </w:t>
-      </w:r>
-      <w:r>
-        <w:t xml:space="preserve">them.</w:t>
+        <w:t xml:space="preserve">The legal text used here is Regulation (EU) 2024/1689 as published in the Official Journal on</w:t>
+      </w:r>
+      <w:r>
+        <w:t xml:space="preserve"> </w:t>
+      </w:r>
+      <w:r>
+        <w:t xml:space="preserve">12 July 2024 (ELI</w:t>
+      </w:r>
+      <w:r>
+        <w:t xml:space="preserve"> </w:t>
+      </w:r>
+      <w:r>
+        <w:rPr>
+          <w:rStyle w:val="VerbatimChar"/>
+        </w:rPr>
+        <w:t xml:space="preserve">http://data.europa.eu/eli/reg/2024/1689/oj</w:t>
+      </w:r>
+      <w:r>
+        <w:t xml:space="preserve">): Article 11, Annex IV, Article 6, Annex III, Article 9,</w:t>
+      </w:r>
+      <w:r>
+        <w:t xml:space="preserve"> </w:t>
+      </w:r>
+      <w:r>
+        <w:t xml:space="preserve">Article 43 and recital 55. I have not checked whether later acts have amended it.</w:t>
       </w:r>
     </w:p>
     <w:p>
@@ -240,47 +240,167 @@
           <w:bCs/>
           <w:b/>
         </w:rPr>
-        <w:t xml:space="preserve">Classification assumption.</w:t>
-      </w:r>
-      <w:r>
-        <w:t xml:space="preserve"> </w:t>
-      </w:r>
-      <w:r>
-        <w:t xml:space="preserve">Annex IV applies to providers of high-risk systems, so the first step in a real file is</w:t>
-      </w:r>
-      <w:r>
-        <w:t xml:space="preserve"> </w:t>
-      </w:r>
-      <w:r>
-        <w:t xml:space="preserve">classification under Article 6. I have not done that analysis against the Regulation’s text. This exercise treats the</w:t>
-      </w:r>
-      <w:r>
-        <w:t xml:space="preserve"> </w:t>
-      </w:r>
-      <w:r>
-        <w:t xml:space="preserve">forecaster as if it were a candidate high-risk system, for example one feeding grid operations planning, because that</w:t>
-      </w:r>
-      <w:r>
-        <w:t xml:space="preserve"> </w:t>
-      </w:r>
-      <w:r>
-        <w:t xml:space="preserve">use gives the documentation a purpose. A load forecaster used only for planning may well fall outside the high-risk</w:t>
-      </w:r>
-      <w:r>
-        <w:t xml:space="preserve"> </w:t>
-      </w:r>
-      <w:r>
-        <w:t xml:space="preserve">categories. That question stays open here.</w:t>
+        <w:t xml:space="preserve">What Article 11 and Annex IV ask for.</w:t>
+      </w:r>
+      <w:r>
+        <w:t xml:space="preserve"> </w:t>
+      </w:r>
+      <w:r>
+        <w:t xml:space="preserve">Article 11(1) says the technical documentation of a high-risk AI system is drawn up</w:t>
+      </w:r>
+      <w:r>
+        <w:t xml:space="preserve"> </w:t>
+      </w:r>
+      <w:r>
+        <w:t xml:space="preserve">before the system is placed on the market or put into service, kept up to date, written to demonstrate compliance with the</w:t>
+      </w:r>
+      <w:r>
+        <w:t xml:space="preserve"> </w:t>
+      </w:r>
+      <w:r>
+        <w:t xml:space="preserve">requirements of Chapter III, Section 2, and to give authorities and notified bodies the information to assess it</w:t>
+      </w:r>
+      <w:r>
+        <w:t xml:space="preserve"> </w:t>
+      </w:r>
+      <w:r>
+        <w:t xml:space="preserve">“</w:t>
+      </w:r>
+      <w:r>
+        <w:t xml:space="preserve">in a clear</w:t>
+      </w:r>
+      <w:r>
+        <w:t xml:space="preserve"> </w:t>
+      </w:r>
+      <w:r>
+        <w:t xml:space="preserve">and comprehensive form</w:t>
+      </w:r>
+      <w:r>
+        <w:t xml:space="preserve">”</w:t>
+      </w:r>
+      <w:r>
+        <w:t xml:space="preserve">. It must contain at least the elements of Annex IV, which has nine numbered points. This document</w:t>
+      </w:r>
+      <w:r>
+        <w:t xml:space="preserve"> </w:t>
+      </w:r>
+      <w:r>
+        <w:t xml:space="preserve">follows those nine headings.</w:t>
+      </w:r>
+    </w:p>
+    <w:p>
+      <w:pPr>
+        <w:pStyle w:val="BodyText"/>
+      </w:pPr>
+      <w:r>
+        <w:rPr>
+          <w:bCs/>
+          <w:b/>
+        </w:rPr>
+        <w:t xml:space="preserve">Classification, and why this exercise is outside the Regulation anyway.</w:t>
+      </w:r>
+      <w:r>
+        <w:t xml:space="preserve"> </w:t>
+      </w:r>
+      <w:r>
+        <w:t xml:space="preserve">Annex IV applies to high-risk systems, so a real</w:t>
+      </w:r>
+      <w:r>
+        <w:t xml:space="preserve"> </w:t>
+      </w:r>
+      <w:r>
+        <w:t xml:space="preserve">file starts with Article 6. The only Annex III entry that could touch this system is point 2: AI systems</w:t>
+      </w:r>
+      <w:r>
+        <w:t xml:space="preserve"> </w:t>
+      </w:r>
+      <w:r>
+        <w:t xml:space="preserve">“</w:t>
+      </w:r>
+      <w:r>
+        <w:t xml:space="preserve">intended to be used</w:t>
+      </w:r>
+      <w:r>
+        <w:t xml:space="preserve"> </w:t>
+      </w:r>
+      <w:r>
+        <w:t xml:space="preserve">as safety components in the management and operation of critical digital infrastructure, road traffic, or in the supply of</w:t>
+      </w:r>
+      <w:r>
+        <w:t xml:space="preserve"> </w:t>
+      </w:r>
+      <w:r>
+        <w:t xml:space="preserve">water, gas, heating or electricity</w:t>
+      </w:r>
+      <w:r>
+        <w:t xml:space="preserve">”</w:t>
+      </w:r>
+      <w:r>
+        <w:t xml:space="preserve">. Article 3(14) defines a safety component by its safety function, and recital 55 describes</w:t>
+      </w:r>
+      <w:r>
+        <w:t xml:space="preserve"> </w:t>
+      </w:r>
+      <w:r>
+        <w:t xml:space="preserve">such components as systems used to directly protect the physical integrity of critical infrastructure or the health and</w:t>
+      </w:r>
+      <w:r>
+        <w:t xml:space="preserve"> </w:t>
+      </w:r>
+      <w:r>
+        <w:t xml:space="preserve">safety of persons and property (its examples are water-pressure monitoring and fire-alarm control). My reading is that a</w:t>
+      </w:r>
+      <w:r>
+        <w:t xml:space="preserve"> </w:t>
+      </w:r>
+      <w:r>
+        <w:t xml:space="preserve">demand forecaster used for planning is not obviously a safety component in that sense, so it would probably not fall under</w:t>
+      </w:r>
+      <w:r>
+        <w:t xml:space="preserve"> </w:t>
+      </w:r>
+      <w:r>
+        <w:t xml:space="preserve">point 2. That is my reading of the text, not a legal opinion. Separately, Article 2(6) excludes AI systems developed and put</w:t>
+      </w:r>
+      <w:r>
+        <w:t xml:space="preserve"> </w:t>
+      </w:r>
+      <w:r>
+        <w:t xml:space="preserve">into service solely for scientific research, and Article 2(8) excludes research, testing and development before a system is</w:t>
+      </w:r>
+      <w:r>
+        <w:t xml:space="preserve"> </w:t>
+      </w:r>
+      <w:r>
+        <w:t xml:space="preserve">placed on the market. This coursework study was never placed on the market, so the Regulation does not apply to it. The</w:t>
+      </w:r>
+      <w:r>
+        <w:t xml:space="preserve"> </w:t>
+      </w:r>
+      <w:r>
+        <w:t xml:space="preserve">document uses the Annex IV structure by choice, to practise documenting evidence in an auditor-readable way. If the</w:t>
+      </w:r>
+      <w:r>
+        <w:t xml:space="preserve"> </w:t>
+      </w:r>
+      <w:r>
+        <w:t xml:space="preserve">system were high-risk under Annex III point 2, Article 43(2) would route it to conformity assessment by internal control</w:t>
+      </w:r>
+      <w:r>
+        <w:t xml:space="preserve"> </w:t>
+      </w:r>
+      <w:r>
+        <w:t xml:space="preserve">(Annex VI), without a notified body.</w:t>
       </w:r>
     </w:p>
     <w:bookmarkEnd w:id="20"/>
-    <w:bookmarkStart w:id="21" w:name="X07dde7df50f3a3c44ad3253515bece9a7e11b2d"/>
+    <w:bookmarkStart w:id="21" w:name="X0846d7514dad22c3a72e6a7005890b9da66f4bb"/>
     <w:p>
       <w:pPr>
         <w:pStyle w:val="Heading2"/>
       </w:pPr>
       <w:r>
-        <w:t xml:space="preserve">1. Purpose and general description (Annex IV, section 1)</w:t>
+        <w:t xml:space="preserve">1. Purpose and general description (Annex IV, point 1)</w:t>
       </w:r>
     </w:p>
     <w:p>
@@ -630,17 +750,23 @@
         <w:t xml:space="preserve"> </w:t>
       </w:r>
       <w:r>
-        <w:t xml:space="preserve">deployers, no instructions for use and no versioned release, because nothing was deployed.</w:t>
+        <w:t xml:space="preserve">deployers, no user interface, no instructions for use (point 1(g), (h)) and no versioned release, because nothing was</w:t>
+      </w:r>
+      <w:r>
+        <w:t xml:space="preserve"> </w:t>
+      </w:r>
+      <w:r>
+        <w:t xml:space="preserve">deployed. Point 1(f), photographs of a product, does not apply.</w:t>
       </w:r>
     </w:p>
     <w:bookmarkEnd w:id="21"/>
-    <w:bookmarkStart w:id="22" w:name="X1906e368d761d72ac579b8c6a7c89e44a4a4034"/>
+    <w:bookmarkStart w:id="22" w:name="X2c45628c69a449d975ddc440b2727f7d417c137"/>
     <w:p>
       <w:pPr>
         <w:pStyle w:val="Heading2"/>
       </w:pPr>
       <w:r>
-        <w:t xml:space="preserve">2. Development and design process (Annex IV, section 2)</w:t>
+        <w:t xml:space="preserve">2. Development and design process (Annex IV, point 2(a) to (c), (e), (f))</w:t>
       </w:r>
     </w:p>
     <w:p>
@@ -859,35 +985,47 @@
           <w:bCs/>
           <w:b/>
         </w:rPr>
-        <w:t xml:space="preserve">Data (see section 3), human oversight and pre-determined changes.</w:t>
-      </w:r>
-      <w:r>
-        <w:t xml:space="preserve"> </w:t>
-      </w:r>
-      <w:r>
-        <w:t xml:space="preserve">Human oversight and pre-determined changes are</w:t>
-      </w:r>
-      <w:r>
-        <w:t xml:space="preserve"> </w:t>
-      </w:r>
-      <w:r>
-        <w:t xml:space="preserve">not applicable: the system has no deployers. What did exist was oversight of the experiment itself. The decision rule was</w:t>
-      </w:r>
-      <w:r>
-        <w:t xml:space="preserve"> </w:t>
-      </w:r>
-      <w:r>
-        <w:t xml:space="preserve">frozen before the nine runs, and every stage needed explicit approval before the next began.</w:t>
+        <w:t xml:space="preserve">Human oversight (point 2(e)) and pre-determined changes (point 2(f)).</w:t>
+      </w:r>
+      <w:r>
+        <w:t xml:space="preserve"> </w:t>
+      </w:r>
+      <w:r>
+        <w:t xml:space="preserve">Point 2(e) asks for an assessment of the oversight</w:t>
+      </w:r>
+      <w:r>
+        <w:t xml:space="preserve"> </w:t>
+      </w:r>
+      <w:r>
+        <w:t xml:space="preserve">measures a system needs under Article 14. I did not make that assessment, because there is no deployer and no</w:t>
+      </w:r>
+      <w:r>
+        <w:t xml:space="preserve"> </w:t>
+      </w:r>
+      <w:r>
+        <w:t xml:space="preserve">decision the model’s output feeds. The model has no pre-determined changes. What did exist was oversight of the experiment</w:t>
+      </w:r>
+      <w:r>
+        <w:t xml:space="preserve"> </w:t>
+      </w:r>
+      <w:r>
+        <w:t xml:space="preserve">itself: the decision rule was frozen before the nine runs, and every stage needed explicit approval before the next began.</w:t>
+      </w:r>
+      <w:r>
+        <w:t xml:space="preserve"> </w:t>
+      </w:r>
+      <w:r>
+        <w:t xml:space="preserve">Computational resources (point 2(c)): one Tesla T4, about 75 minutes in total for calibration, pilot and the nine main runs.</w:t>
       </w:r>
     </w:p>
     <w:bookmarkEnd w:id="22"/>
-    <w:bookmarkStart w:id="23" w:name="X41859b99f98ec19e4bc3dc9ef30d69c1f064673"/>
+    <w:bookmarkStart w:id="23" w:name="Xb3c1188bf16a44655e9792ff296e144d026472c"/>
     <w:p>
       <w:pPr>
         <w:pStyle w:val="Heading2"/>
       </w:pPr>
       <w:r>
-        <w:t xml:space="preserve">3. Data provenance and governance (Annex IV, section 2, data)</w:t>
+        <w:t xml:space="preserve">3. Data provenance and governance (Annex IV, point 2(d); Article 10)</w:t>
       </w:r>
     </w:p>
     <w:tbl>
@@ -1195,6 +1333,40 @@
               <w:rPr>
                 <w:sz w:val="17"/>
               </w:rPr>
+              <w:t xml:space="preserve">Labelling and cleaning</w:t>
+            </w:r>
+          </w:p>
+        </w:tc>
+        <w:tc>
+          <w:tcPr/>
+          <w:p>
+            <w:pPr>
+              <w:pStyle w:val="Compact"/>
+              <w:spacing w:after="0"/>
+              <w:jc w:val="left"/>
+            </w:pPr>
+            <w:r>
+              <w:rPr>
+                <w:sz w:val="17"/>
+              </w:rPr>
+              <w:t xml:space="preserve">No labels: the target is the next 24 hours of the same series. Gaps are filled with the last earlier value. Outlier hours are part of the generated series and were not removed.</w:t>
+            </w:r>
+          </w:p>
+        </w:tc>
+      </w:tr>
+      <w:tr>
+        <w:tc>
+          <w:tcPr/>
+          <w:p>
+            <w:pPr>
+              <w:pStyle w:val="Compact"/>
+              <w:spacing w:after="0"/>
+              <w:jc w:val="left"/>
+            </w:pPr>
+            <w:r>
+              <w:rPr>
+                <w:sz w:val="17"/>
+              </w:rPr>
               <w:t xml:space="preserve">Personal data</w:t>
             </w:r>
           </w:p>
@@ -1248,13 +1420,13 @@
       </w:r>
     </w:p>
     <w:bookmarkEnd w:id="23"/>
-    <w:bookmarkStart w:id="24" w:name="training-methodology-annex-iv-section-2"/>
+    <w:bookmarkStart w:id="24" w:name="Xe3b7cfe93aa9b80f68e428a08a5393ecee4954b"/>
     <w:p>
       <w:pPr>
         <w:pStyle w:val="Heading2"/>
       </w:pPr>
       <w:r>
-        <w:t xml:space="preserve">4. Training methodology (Annex IV, section 2)</w:t>
+        <w:t xml:space="preserve">4. Training methodology (Annex IV, point 2(a), (b), (c))</w:t>
       </w:r>
     </w:p>
     <w:p>
@@ -1353,13 +1525,13 @@
       </w:r>
     </w:p>
     <w:bookmarkEnd w:id="24"/>
-    <w:bookmarkStart w:id="25" w:name="Xf8665296855b096cc11acb6ab3b8831f6e1eee4"/>
+    <w:bookmarkStart w:id="25" w:name="Xf36b3472a92bc114a942090a94534a24f2b9e93"/>
     <w:p>
       <w:pPr>
         <w:pStyle w:val="Heading2"/>
       </w:pPr>
       <w:r>
-        <w:t xml:space="preserve">5. Evaluation metrics and results (Annex IV, section 4)</w:t>
+        <w:t xml:space="preserve">5. Evaluation metrics and results (Annex IV, points 2(g) and 4)</w:t>
       </w:r>
     </w:p>
     <w:p>
@@ -1402,6 +1574,48 @@
       </w:r>
       <w:r>
         <w:t xml:space="preserve">operationally. Two seasonal baselines score 7.08 and 7.17.</w:t>
+      </w:r>
+    </w:p>
+    <w:p>
+      <w:pPr>
+        <w:pStyle w:val="BodyText"/>
+      </w:pPr>
+      <w:r>
+        <w:rPr>
+          <w:bCs/>
+          <w:b/>
+        </w:rPr>
+        <w:t xml:space="preserve">Test logs (point 2(g)).</w:t>
+      </w:r>
+      <w:r>
+        <w:t xml:space="preserve"> </w:t>
+      </w:r>
+      <w:r>
+        <w:t xml:space="preserve">Every run writes a JSON record with start and finish times, commit, GPU, metrics and hashes, and the</w:t>
+      </w:r>
+      <w:r>
+        <w:t xml:space="preserve"> </w:t>
+      </w:r>
+      <w:r>
+        <w:t xml:space="preserve">results are in</w:t>
+      </w:r>
+      <w:r>
+        <w:t xml:space="preserve"> </w:t>
+      </w:r>
+      <w:r>
+        <w:rPr>
+          <w:rStyle w:val="VerbatimChar"/>
+        </w:rPr>
+        <w:t xml:space="preserve">results/runs/</w:t>
+      </w:r>
+      <w:r>
+        <w:t xml:space="preserve">. Annex IV asks for test reports dated and signed by the responsible persons. These records are</w:t>
+      </w:r>
+      <w:r>
+        <w:t xml:space="preserve"> </w:t>
+      </w:r>
+      <w:r>
+        <w:t xml:space="preserve">dated but not signed.</w:t>
       </w:r>
     </w:p>
     <w:p>
@@ -1944,13 +2158,13 @@
       </w:r>
     </w:p>
     <w:bookmarkEnd w:id="25"/>
-    <w:bookmarkStart w:id="26" w:name="Xecdad4f7184abc1146b2987c952408b79b68067"/>
+    <w:bookmarkStart w:id="26" w:name="Xf5dad829a6ffaf06a51927a6c2f75f251b012f8"/>
     <w:p>
       <w:pPr>
         <w:pStyle w:val="Heading2"/>
       </w:pPr>
       <w:r>
-        <w:t xml:space="preserve">6. Limitations, known risks and residual risk (Annex IV, section 5)</w:t>
+        <w:t xml:space="preserve">6. Limitations, known risks and residual risk (Annex IV, points 3 and 5)</w:t>
       </w:r>
     </w:p>
     <w:tbl>
@@ -2669,13 +2883,13 @@
       </w:tr>
     </w:tbl>
     <w:bookmarkEnd w:id="26"/>
-    <w:bookmarkStart w:id="27" w:name="X141f410ee3406a31bf55af71c1f992505803713"/>
+    <w:bookmarkStart w:id="27" w:name="X49ed84adb7bed8f9669947280a0871678804f13"/>
     <w:p>
       <w:pPr>
         <w:pStyle w:val="Heading2"/>
       </w:pPr>
       <w:r>
-        <w:t xml:space="preserve">7. Lifecycle, standards, declaration and monitoring (Annex IV, sections 6 to 9)</w:t>
+        <w:t xml:space="preserve">7. Monitoring, lifecycle, standards, declaration, post-market (Annex IV, points 3 and 6 to 9)</w:t>
       </w:r>
     </w:p>
     <w:tbl>
@@ -2763,7 +2977,7 @@
               <w:rPr>
                 <w:sz w:val="17"/>
               </w:rPr>
-              <w:t xml:space="preserve">Run files record commit, GPU id, session, policy, config hash and data and weight hashes. No deployed system exists, so no operational logging or alerts.</w:t>
+              <w:t xml:space="preserve">Capabilities, limitations and foreseeable unintended outcomes are in section 6. Run files record commit, GPU id, session, policy, config hash and data and weight hashes. No deployed system exists, so no operational logging or alerts.</w:t>
             </w:r>
           </w:p>
         </w:tc>
@@ -2932,7 +3146,7 @@
               <w:rPr>
                 <w:sz w:val="17"/>
               </w:rPr>
-              <w:t xml:space="preserve">None applied. The next section maps the work to two frameworks, which is not a claim of conformity to any standard.</w:t>
+              <w:t xml:space="preserve">None applied. Point 7 then asks for a description of the solutions adopted and other standards used; this document is that description. Section 8 maps the work to two frameworks, which is not a claim of conformity to any standard.</w:t>
             </w:r>
           </w:p>
         </w:tc>
@@ -2950,7 +3164,7 @@
               <w:rPr>
                 <w:sz w:val="17"/>
               </w:rPr>
-              <w:t xml:space="preserve">8. EU declaration of conformity</w:t>
+              <w:t xml:space="preserve">8. EU declaration of conformity (Article 47)</w:t>
             </w:r>
           </w:p>
         </w:tc>
@@ -2986,7 +3200,7 @@
               <w:rPr>
                 <w:sz w:val="17"/>
               </w:rPr>
-              <w:t xml:space="preserve">9. Post-market monitoring plan</w:t>
+              <w:t xml:space="preserve">9. Post-market monitoring plan (Article 72(3))</w:t>
             </w:r>
           </w:p>
         </w:tc>
@@ -3361,7 +3575,13 @@
         <w:pStyle w:val="Compact"/>
       </w:pPr>
       <w:r>
-        <w:t xml:space="preserve">Check the Annex IV heading list and the Article 11(1) wording against the Regulation on EUR-Lex.</w:t>
+        <w:t xml:space="preserve">If the course expects a classification conclusion, have the Article 6 and Annex III point 2 reading in section 0 checked,</w:t>
+      </w:r>
+      <w:r>
+        <w:t xml:space="preserve"> </w:t>
+      </w:r>
+      <w:r>
+        <w:t xml:space="preserve">since it is my reading and not a legal opinion.</w:t>
       </w:r>
     </w:p>
     <w:p>
@@ -3373,19 +3593,7 @@
         <w:pStyle w:val="Compact"/>
       </w:pPr>
       <w:r>
-        <w:t xml:space="preserve">Analyse Article 6 classification against the Regulation’s text and replace the assumption in section 0.</w:t>
-      </w:r>
-    </w:p>
-    <w:p>
-      <w:pPr>
-        <w:numPr>
-          <w:ilvl w:val="0"/>
-          <w:numId w:val="1002"/>
-        </w:numPr>
-        <w:pStyle w:val="Compact"/>
-      </w:pPr>
-      <w:r>
-        <w:t xml:space="preserve">Confirm the crosswalk level of detail against what the course materials ask for.</w:t>
+        <w:t xml:space="preserve">Check whether the Regulation has been amended since the 2024 text used here.</w:t>
       </w:r>
     </w:p>
     <w:bookmarkEnd w:id="29"/>

</xml_diff>

<commit_message>
Annex IV summary: state text version as provided with assignment; trim open items
Co-Authored-By: Claude Sonnet 5.5 <noreply@anthropic.com>
Claude-Session: https://claude.ai/code/session_01QhzwnEWQ4QfqKTzswE5K7H
</commit_message>
<xml_diff>
--- a/week7_capstone/docs/ANNEX_IV.docx
+++ b/week7_capstone/docs/ANNEX_IV.docx
@@ -228,7 +228,7 @@
         <w:t xml:space="preserve"> </w:t>
       </w:r>
       <w:r>
-        <w:t xml:space="preserve">Article 43 and recital 55. I have not checked whether later acts have amended it.</w:t>
+        <w:t xml:space="preserve">Article 43 and recital 55. This is the version provided with the assignment, and later amendments, if any, are not reflected.</w:t>
       </w:r>
     </w:p>
     <w:p>
@@ -3557,43 +3557,27 @@
       </w:r>
     </w:p>
     <w:bookmarkEnd w:id="28"/>
-    <w:bookmarkStart w:id="29" w:name="open-items-before-submission"/>
+    <w:bookmarkStart w:id="29" w:name="open-item-before-submission"/>
     <w:p>
       <w:pPr>
         <w:pStyle w:val="Heading2"/>
       </w:pPr>
       <w:r>
-        <w:t xml:space="preserve">9. Open items before submission</w:t>
+        <w:t xml:space="preserve">9. Open item before submission</w:t>
       </w:r>
     </w:p>
     <w:p>
       <w:pPr>
-        <w:numPr>
-          <w:ilvl w:val="0"/>
-          <w:numId w:val="1002"/>
-        </w:numPr>
-        <w:pStyle w:val="Compact"/>
-      </w:pPr>
-      <w:r>
-        <w:t xml:space="preserve">If the course expects a classification conclusion, have the Article 6 and Annex III point 2 reading in section 0 checked,</w:t>
-      </w:r>
-      <w:r>
-        <w:t xml:space="preserve"> </w:t>
-      </w:r>
-      <w:r>
-        <w:t xml:space="preserve">since it is my reading and not a legal opinion.</w:t>
-      </w:r>
-    </w:p>
-    <w:p>
-      <w:pPr>
-        <w:numPr>
-          <w:ilvl w:val="0"/>
-          <w:numId w:val="1002"/>
-        </w:numPr>
-        <w:pStyle w:val="Compact"/>
-      </w:pPr>
-      <w:r>
-        <w:t xml:space="preserve">Check whether the Regulation has been amended since the 2024 text used here.</w:t>
+        <w:pStyle w:val="FirstParagraph"/>
+      </w:pPr>
+      <w:r>
+        <w:t xml:space="preserve">The Article 6 and Annex III point 2 reading in section 0 is my reading of the text, not a legal opinion. If the course</w:t>
+      </w:r>
+      <w:r>
+        <w:t xml:space="preserve"> </w:t>
+      </w:r>
+      <w:r>
+        <w:t xml:space="preserve">expects a firm classification, have it checked.</w:t>
       </w:r>
     </w:p>
     <w:bookmarkEnd w:id="29"/>
@@ -3781,126 +3765,11 @@
       </w:pPr>
     </w:lvl>
   </w:abstractNum>
-  <w:abstractNum w:abstractNumId="99411">
-    <w:nsid w:val="A99411"/>
-    <w:multiLevelType w:val="multilevel"/>
-    <w:lvl w:ilvl="0">
-      <w:start w:val="1"/>
-      <w:numFmt w:val="decimal"/>
-      <w:lvlText w:val="%1."/>
-      <w:lvlJc w:val="left"/>
-      <w:pPr>
-        <w:ind w:left="720" w:hanging="480"/>
-      </w:pPr>
-    </w:lvl>
-    <w:lvl w:ilvl="1">
-      <w:start w:val="1"/>
-      <w:numFmt w:val="decimal"/>
-      <w:lvlText w:val="%2."/>
-      <w:lvlJc w:val="left"/>
-      <w:pPr>
-        <w:ind w:left="1440" w:hanging="480"/>
-      </w:pPr>
-    </w:lvl>
-    <w:lvl w:ilvl="2">
-      <w:start w:val="1"/>
-      <w:numFmt w:val="decimal"/>
-      <w:lvlText w:val="%3."/>
-      <w:lvlJc w:val="left"/>
-      <w:pPr>
-        <w:ind w:left="2160" w:hanging="480"/>
-      </w:pPr>
-    </w:lvl>
-    <w:lvl w:ilvl="3">
-      <w:start w:val="1"/>
-      <w:numFmt w:val="decimal"/>
-      <w:lvlText w:val="%4."/>
-      <w:lvlJc w:val="left"/>
-      <w:pPr>
-        <w:ind w:left="2880" w:hanging="480"/>
-      </w:pPr>
-    </w:lvl>
-    <w:lvl w:ilvl="4">
-      <w:start w:val="1"/>
-      <w:numFmt w:val="decimal"/>
-      <w:lvlText w:val="%5."/>
-      <w:lvlJc w:val="left"/>
-      <w:pPr>
-        <w:ind w:left="3600" w:hanging="480"/>
-      </w:pPr>
-    </w:lvl>
-    <w:lvl w:ilvl="5">
-      <w:start w:val="1"/>
-      <w:numFmt w:val="decimal"/>
-      <w:lvlText w:val="%6."/>
-      <w:lvlJc w:val="left"/>
-      <w:pPr>
-        <w:ind w:left="4320" w:hanging="480"/>
-      </w:pPr>
-    </w:lvl>
-    <w:lvl w:ilvl="6">
-      <w:start w:val="1"/>
-      <w:numFmt w:val="decimal"/>
-      <w:lvlText w:val="%7."/>
-      <w:lvlJc w:val="left"/>
-      <w:pPr>
-        <w:ind w:left="5040" w:hanging="480"/>
-      </w:pPr>
-    </w:lvl>
-    <w:lvl w:ilvl="7">
-      <w:start w:val="1"/>
-      <w:numFmt w:val="decimal"/>
-      <w:lvlText w:val="%8."/>
-      <w:lvlJc w:val="left"/>
-      <w:pPr>
-        <w:ind w:left="5760" w:hanging="480"/>
-      </w:pPr>
-    </w:lvl>
-    <w:lvl w:ilvl="8">
-      <w:start w:val="1"/>
-      <w:numFmt w:val="decimal"/>
-      <w:lvlText w:val="%9."/>
-      <w:lvlJc w:val="left"/>
-      <w:pPr>
-        <w:ind w:left="6480" w:hanging="480"/>
-      </w:pPr>
-    </w:lvl>
-  </w:abstractNum>
   <w:num w:numId="1000">
     <w:abstractNumId w:val="990"/>
   </w:num>
   <w:num w:numId="1001">
     <w:abstractNumId w:val="991"/>
-  </w:num>
-  <w:num w:numId="1002">
-    <w:abstractNumId w:val="99411"/>
-    <w:lvlOverride w:ilvl="0">
-      <w:startOverride w:val="1"/>
-    </w:lvlOverride>
-    <w:lvlOverride w:ilvl="1">
-      <w:startOverride w:val="1"/>
-    </w:lvlOverride>
-    <w:lvlOverride w:ilvl="2">
-      <w:startOverride w:val="1"/>
-    </w:lvlOverride>
-    <w:lvlOverride w:ilvl="3">
-      <w:startOverride w:val="1"/>
-    </w:lvlOverride>
-    <w:lvlOverride w:ilvl="4">
-      <w:startOverride w:val="1"/>
-    </w:lvlOverride>
-    <w:lvlOverride w:ilvl="5">
-      <w:startOverride w:val="1"/>
-    </w:lvlOverride>
-    <w:lvlOverride w:ilvl="6">
-      <w:startOverride w:val="1"/>
-    </w:lvlOverride>
-    <w:lvlOverride w:ilvl="7">
-      <w:startOverride w:val="1"/>
-    </w:lvlOverride>
-    <w:lvlOverride w:ilvl="8">
-      <w:startOverride w:val="1"/>
-    </w:lvlOverride>
   </w:num>
 </w:numbering>
 </file>

</xml_diff>